<commit_message>
chore: drop NexusFlow and CV Risk Detection from portfolio and resume
</commit_message>
<xml_diff>
--- a/public/Vinay_G_Resume.docx
+++ b/public/Vinay_G_Resume.docx
@@ -737,6 +737,26 @@
     </w:p>
     <w:p>
       <w:pPr>
+        <w:spacing w:after="20"/>
+        <w:ind w:left="230" w:hanging="173"/>
+      </w:pPr>
+      <w:r>
+        <w:rPr>
+          <w:b w:val="0"/>
+          <w:i w:val="0"/>
+        </w:rPr>
+        <w:t xml:space="preserve">•  </w:t>
+      </w:r>
+      <w:r>
+        <w:rPr>
+          <w:b w:val="0"/>
+          <w:i w:val="0"/>
+        </w:rPr>
+        <w:t>Privacy by design: reporter identities stored only as keyed hashes, personal details stripped, and groups of fewer than 5 people never shown.</w:t>
+      </w:r>
+    </w:p>
+    <w:p>
+      <w:pPr>
         <w:tabs>
           <w:tab w:pos="10512" w:val="right"/>
         </w:tabs>
@@ -824,166 +844,6 @@
     </w:p>
     <w:p>
       <w:pPr>
-        <w:tabs>
-          <w:tab w:pos="10512" w:val="right"/>
-        </w:tabs>
-        <w:spacing w:before="70"/>
-      </w:pPr>
-      <w:r>
-        <w:rPr>
-          <w:b/>
-          <w:i w:val="0"/>
-          <w:sz w:val="21"/>
-        </w:rPr>
-        <w:t>NexusFlow</w:t>
-      </w:r>
-      <w:r>
-        <w:rPr>
-          <w:b w:val="0"/>
-          <w:i w:val="0"/>
-          <w:color w:val="555555"/>
-        </w:rPr>
-        <w:t xml:space="preserve">  |  Autonomous multi-agent app builder</w:t>
-      </w:r>
-      <w:r>
-        <w:rPr>
-          <w:b w:val="0"/>
-          <w:i w:val="0"/>
-        </w:rPr>
-        <w:tab/>
-      </w:r>
-      <w:hyperlink r:id="rId16">
-        <w:r>
-          <w:rPr>
-            <w:color w:val="9A3B1E"/>
-          </w:rPr>
-          <w:t xml:space="preserve">Live demo</w:t>
-        </w:r>
-      </w:hyperlink>
-    </w:p>
-    <w:p>
-      <w:pPr>
-        <w:spacing w:after="20"/>
-      </w:pPr>
-      <w:r>
-        <w:rPr>
-          <w:b w:val="0"/>
-          <w:i/>
-          <w:color w:val="555555"/>
-          <w:sz w:val="18"/>
-        </w:rPr>
-        <w:t>React · TypeScript · FastAPI · PostgreSQL · ChromaDB · Groq</w:t>
-      </w:r>
-    </w:p>
-    <w:p>
-      <w:pPr>
-        <w:spacing w:after="20"/>
-        <w:ind w:left="230" w:hanging="173"/>
-      </w:pPr>
-      <w:r>
-        <w:rPr>
-          <w:b w:val="0"/>
-          <w:i w:val="0"/>
-        </w:rPr>
-        <w:t xml:space="preserve">•  </w:t>
-      </w:r>
-      <w:r>
-        <w:rPr>
-          <w:b w:val="0"/>
-          <w:i w:val="0"/>
-        </w:rPr>
-        <w:t xml:space="preserve">Generates full-stack apps from a plain-English brief; a DebuggingAgent with </w:t>
-      </w:r>
-      <w:r>
-        <w:rPr>
-          <w:b/>
-          <w:i w:val="0"/>
-        </w:rPr>
-        <w:t>27 deterministic repair rules</w:t>
-      </w:r>
-      <w:r>
-        <w:rPr>
-          <w:b w:val="0"/>
-          <w:i w:val="0"/>
-        </w:rPr>
-        <w:t xml:space="preserve"> and 10 static checks fixes LLM output without another model call, boots the app to verify it runs, then pushes to GitHub.</w:t>
-      </w:r>
-    </w:p>
-    <w:p>
-      <w:pPr>
-        <w:tabs>
-          <w:tab w:pos="10512" w:val="right"/>
-        </w:tabs>
-        <w:spacing w:before="70"/>
-      </w:pPr>
-      <w:r>
-        <w:rPr>
-          <w:b/>
-          <w:i w:val="0"/>
-          <w:sz w:val="21"/>
-        </w:rPr>
-        <w:t>CV Risk Detection</w:t>
-      </w:r>
-      <w:r>
-        <w:rPr>
-          <w:b w:val="0"/>
-          <w:i w:val="0"/>
-          <w:color w:val="555555"/>
-        </w:rPr>
-        <w:t xml:space="preserve">  |  Defect detection for supply-chain QA</w:t>
-      </w:r>
-      <w:r>
-        <w:rPr>
-          <w:b w:val="0"/>
-          <w:i w:val="0"/>
-        </w:rPr>
-        <w:tab/>
-      </w:r>
-      <w:hyperlink r:id="rId17">
-        <w:r>
-          <w:rPr>
-            <w:color w:val="9A3B1E"/>
-          </w:rPr>
-          <w:t xml:space="preserve">github</w:t>
-        </w:r>
-      </w:hyperlink>
-    </w:p>
-    <w:p>
-      <w:pPr>
-        <w:spacing w:after="20"/>
-        <w:ind w:left="230" w:hanging="173"/>
-      </w:pPr>
-      <w:r>
-        <w:rPr>
-          <w:b w:val="0"/>
-          <w:i w:val="0"/>
-        </w:rPr>
-        <w:t xml:space="preserve">•  </w:t>
-      </w:r>
-      <w:r>
-        <w:rPr>
-          <w:b w:val="0"/>
-          <w:i w:val="0"/>
-        </w:rPr>
-        <w:t xml:space="preserve">MobileNetV2 transfer learning on magnetic-tile defects, </w:t>
-      </w:r>
-      <w:r>
-        <w:rPr>
-          <w:b/>
-          <w:i w:val="0"/>
-        </w:rPr>
-        <w:t>86.96% validation accuracy</w:t>
-      </w:r>
-      <w:r>
-        <w:rPr>
-          <w:b w:val="0"/>
-          <w:i w:val="0"/>
-        </w:rPr>
-        <w:t>; FastAPI + React dashboard.</w:t>
-      </w:r>
-    </w:p>
-    <w:p>
-      <w:pPr>
         <w:spacing w:before="140" w:after="60"/>
         <w:pBdr>
           <w:bottom w:val="single" w:sz="6" w:space="1" w:color="9A3B1E"/>
@@ -1034,7 +894,7 @@
           <w:b w:val="0"/>
           <w:i w:val="0"/>
         </w:rPr>
-        <w:t>LLM agents &amp; tool use (Claude, Gemini, Groq), MCP, RAG, pgvector, ChromaDB, TensorFlow, transfer learning</w:t>
+        <w:t>LLM agents &amp; tool use (Claude, Gemini, Groq), MCP, RAG, pgvector, prompt design with code-checked outputs</w:t>
       </w:r>
     </w:p>
     <w:p>
@@ -1102,7 +962,7 @@
         </w:rPr>
         <w:t xml:space="preserve">Profiles: </w:t>
       </w:r>
-      <w:hyperlink r:id="rId18">
+      <w:hyperlink r:id="rId16">
         <w:r>
           <w:rPr>
             <w:color w:val="1A1A1A"/>
@@ -1117,7 +977,7 @@
         </w:rPr>
         <w:t xml:space="preserve">  ·  </w:t>
       </w:r>
-      <w:hyperlink r:id="rId19">
+      <w:hyperlink r:id="rId17">
         <w:r>
           <w:rPr>
             <w:color w:val="1A1A1A"/>

</xml_diff>

<commit_message>
chore: loosen resume line and section spacing for readability
</commit_message>
<xml_diff>
--- a/public/Vinay_G_Resume.docx
+++ b/public/Vinay_G_Resume.docx
@@ -118,7 +118,7 @@
     </w:p>
     <w:p>
       <w:pPr>
-        <w:spacing w:before="140" w:after="60"/>
+        <w:spacing w:before="180" w:after="80"/>
         <w:pBdr>
           <w:bottom w:val="single" w:sz="6" w:space="1" w:color="9A3B1E"/>
         </w:pBdr>
@@ -158,7 +158,7 @@
     </w:p>
     <w:p>
       <w:pPr>
-        <w:spacing w:before="140" w:after="60"/>
+        <w:spacing w:before="180" w:after="80"/>
         <w:pBdr>
           <w:bottom w:val="single" w:sz="6" w:space="1" w:color="9A3B1E"/>
         </w:pBdr>
@@ -205,7 +205,7 @@
     </w:p>
     <w:p>
       <w:pPr>
-        <w:spacing w:before="140" w:after="60"/>
+        <w:spacing w:before="180" w:after="80"/>
         <w:pBdr>
           <w:bottom w:val="single" w:sz="6" w:space="1" w:color="9A3B1E"/>
         </w:pBdr>
@@ -222,7 +222,7 @@
     </w:p>
     <w:p>
       <w:pPr>
-        <w:spacing w:after="20"/>
+        <w:spacing w:after="36"/>
         <w:ind w:left="230" w:hanging="173"/>
       </w:pPr>
       <w:r>
@@ -255,7 +255,7 @@
     </w:p>
     <w:p>
       <w:pPr>
-        <w:spacing w:after="20"/>
+        <w:spacing w:after="36"/>
         <w:ind w:left="230" w:hanging="173"/>
       </w:pPr>
       <w:r>
@@ -275,7 +275,7 @@
     </w:p>
     <w:p>
       <w:pPr>
-        <w:spacing w:before="140" w:after="60"/>
+        <w:spacing w:before="180" w:after="80"/>
         <w:pBdr>
           <w:bottom w:val="single" w:sz="6" w:space="1" w:color="9A3B1E"/>
         </w:pBdr>
@@ -295,7 +295,7 @@
         <w:tabs>
           <w:tab w:pos="10512" w:val="right"/>
         </w:tabs>
-        <w:spacing w:before="70"/>
+        <w:spacing w:before="100"/>
       </w:pPr>
       <w:r>
         <w:rPr>
@@ -331,7 +331,7 @@
     </w:p>
     <w:p>
       <w:pPr>
-        <w:spacing w:after="20"/>
+        <w:spacing w:after="50"/>
       </w:pPr>
       <w:r>
         <w:rPr>
@@ -345,7 +345,7 @@
     </w:p>
     <w:p>
       <w:pPr>
-        <w:spacing w:after="20"/>
+        <w:spacing w:after="36"/>
         <w:ind w:left="230" w:hanging="173"/>
       </w:pPr>
       <w:r>
@@ -379,7 +379,7 @@
     </w:p>
     <w:p>
       <w:pPr>
-        <w:spacing w:after="20"/>
+        <w:spacing w:after="36"/>
         <w:ind w:left="230" w:hanging="173"/>
       </w:pPr>
       <w:r>
@@ -427,7 +427,7 @@
     </w:p>
     <w:p>
       <w:pPr>
-        <w:spacing w:after="20"/>
+        <w:spacing w:after="36"/>
         <w:ind w:left="230" w:hanging="173"/>
       </w:pPr>
       <w:r>
@@ -464,7 +464,7 @@
         <w:tabs>
           <w:tab w:pos="10512" w:val="right"/>
         </w:tabs>
-        <w:spacing w:before="70"/>
+        <w:spacing w:before="100"/>
       </w:pPr>
       <w:r>
         <w:rPr>
@@ -500,7 +500,7 @@
     </w:p>
     <w:p>
       <w:pPr>
-        <w:spacing w:after="20"/>
+        <w:spacing w:after="50"/>
       </w:pPr>
       <w:r>
         <w:rPr>
@@ -514,7 +514,7 @@
     </w:p>
     <w:p>
       <w:pPr>
-        <w:spacing w:after="20"/>
+        <w:spacing w:after="36"/>
         <w:ind w:left="230" w:hanging="173"/>
       </w:pPr>
       <w:r>
@@ -548,7 +548,7 @@
     </w:p>
     <w:p>
       <w:pPr>
-        <w:spacing w:after="20"/>
+        <w:spacing w:after="36"/>
         <w:ind w:left="230" w:hanging="173"/>
       </w:pPr>
       <w:r>
@@ -582,7 +582,7 @@
     </w:p>
     <w:p>
       <w:pPr>
-        <w:spacing w:after="20"/>
+        <w:spacing w:after="36"/>
         <w:ind w:left="230" w:hanging="173"/>
       </w:pPr>
       <w:r>
@@ -619,7 +619,7 @@
         <w:tabs>
           <w:tab w:pos="10512" w:val="right"/>
         </w:tabs>
-        <w:spacing w:before="70"/>
+        <w:spacing w:before="100"/>
       </w:pPr>
       <w:r>
         <w:rPr>
@@ -655,7 +655,7 @@
     </w:p>
     <w:p>
       <w:pPr>
-        <w:spacing w:after="20"/>
+        <w:spacing w:after="50"/>
       </w:pPr>
       <w:r>
         <w:rPr>
@@ -669,7 +669,7 @@
     </w:p>
     <w:p>
       <w:pPr>
-        <w:spacing w:after="20"/>
+        <w:spacing w:after="36"/>
         <w:ind w:left="230" w:hanging="173"/>
       </w:pPr>
       <w:r>
@@ -703,7 +703,7 @@
     </w:p>
     <w:p>
       <w:pPr>
-        <w:spacing w:after="20"/>
+        <w:spacing w:after="36"/>
         <w:ind w:left="230" w:hanging="173"/>
       </w:pPr>
       <w:r>
@@ -737,7 +737,7 @@
     </w:p>
     <w:p>
       <w:pPr>
-        <w:spacing w:after="20"/>
+        <w:spacing w:after="36"/>
         <w:ind w:left="230" w:hanging="173"/>
       </w:pPr>
       <w:r>
@@ -760,7 +760,7 @@
         <w:tabs>
           <w:tab w:pos="10512" w:val="right"/>
         </w:tabs>
-        <w:spacing w:before="70"/>
+        <w:spacing w:before="100"/>
       </w:pPr>
       <w:r>
         <w:rPr>
@@ -796,7 +796,7 @@
     </w:p>
     <w:p>
       <w:pPr>
-        <w:spacing w:after="20"/>
+        <w:spacing w:after="50"/>
       </w:pPr>
       <w:r>
         <w:rPr>
@@ -810,7 +810,7 @@
     </w:p>
     <w:p>
       <w:pPr>
-        <w:spacing w:after="20"/>
+        <w:spacing w:after="36"/>
         <w:ind w:left="230" w:hanging="173"/>
       </w:pPr>
       <w:r>
@@ -844,7 +844,7 @@
     </w:p>
     <w:p>
       <w:pPr>
-        <w:spacing w:before="140" w:after="60"/>
+        <w:spacing w:before="180" w:after="80"/>
         <w:pBdr>
           <w:bottom w:val="single" w:sz="6" w:space="1" w:color="9A3B1E"/>
         </w:pBdr>
@@ -861,7 +861,7 @@
     </w:p>
     <w:p>
       <w:pPr>
-        <w:spacing w:after="30"/>
+        <w:spacing w:after="50"/>
       </w:pPr>
       <w:r>
         <w:rPr>
@@ -880,7 +880,7 @@
     </w:p>
     <w:p>
       <w:pPr>
-        <w:spacing w:after="30"/>
+        <w:spacing w:after="50"/>
       </w:pPr>
       <w:r>
         <w:rPr>
@@ -899,7 +899,7 @@
     </w:p>
     <w:p>
       <w:pPr>
-        <w:spacing w:after="30"/>
+        <w:spacing w:after="50"/>
       </w:pPr>
       <w:r>
         <w:rPr>
@@ -918,7 +918,7 @@
     </w:p>
     <w:p>
       <w:pPr>
-        <w:spacing w:after="30"/>
+        <w:spacing w:after="50"/>
       </w:pPr>
       <w:r>
         <w:rPr>
@@ -937,7 +937,7 @@
     </w:p>
     <w:p>
       <w:pPr>
-        <w:spacing w:after="30"/>
+        <w:spacing w:after="50"/>
       </w:pPr>
       <w:r>
         <w:rPr>
@@ -1374,7 +1374,7 @@
     <w:qFormat/>
     <w:rsid w:val="00FC693F"/>
     <w:pPr>
-      <w:spacing w:after="0" w:before="0" w:line="240" w:lineRule="auto"/>
+      <w:spacing w:after="0" w:before="0" w:line="252" w:lineRule="auto"/>
     </w:pPr>
     <w:rPr>
       <w:rFonts w:ascii="Calibri" w:hAnsi="Calibri" w:eastAsia="Calibri"/>

</xml_diff>

<commit_message>
feat: update portfolio to Oct 2026 resume, add OmniConnect, Fastforward and certificates
</commit_message>
<xml_diff>
--- a/public/Vinay_G_Resume.docx
+++ b/public/Vinay_G_Resume.docx
@@ -4,1005 +4,582 @@
   <w:body>
     <w:p>
       <w:pPr>
+        <w:spacing w:after="60" w:before="0" w:line="269" w:lineRule="auto"/>
         <w:jc w:val="center"/>
       </w:pPr>
       <w:r>
         <w:rPr>
           <w:b/>
-          <w:i w:val="0"/>
-          <w:sz w:val="44"/>
+          <w:sz w:val="48"/>
         </w:rPr>
         <w:t>Vinay G</w:t>
       </w:r>
     </w:p>
     <w:p>
       <w:pPr>
-        <w:spacing w:after="60"/>
+        <w:spacing w:after="60" w:before="0" w:line="269" w:lineRule="auto"/>
         <w:jc w:val="center"/>
       </w:pPr>
       <w:r>
         <w:rPr>
           <w:b w:val="0"/>
-          <w:i w:val="0"/>
-          <w:color w:val="9A3B1E"/>
-          <w:sz w:val="22"/>
         </w:rPr>
-        <w:t>Software Engineer  ·  AI Agents &amp; Full-Stack  ·  Bengaluru</w:t>
+        <w:t>AI Product Builder | Software Engineer | Bengaluru, India</w:t>
       </w:r>
     </w:p>
     <w:p>
       <w:pPr>
+        <w:spacing w:after="60" w:before="0" w:line="269" w:lineRule="auto"/>
         <w:jc w:val="center"/>
       </w:pPr>
-      <w:hyperlink r:id="rId9">
-        <w:r>
-          <w:rPr>
-            <w:color w:val="1A1A1A"/>
-            <w:sz w:val="18"/>
-          </w:rPr>
-          <w:t xml:space="preserve">+91 89041 27547</w:t>
-        </w:r>
-      </w:hyperlink>
       <w:r>
         <w:rPr>
           <w:b w:val="0"/>
-          <w:i w:val="0"/>
-          <w:color w:val="555555"/>
-          <w:sz w:val="18"/>
         </w:rPr>
-        <w:t xml:space="preserve">  |  </w:t>
+        <w:t>+91 89041 27547 | vinayg1752004@gmail.com | github.com/VinayG759</w:t>
       </w:r>
-      <w:hyperlink r:id="rId10">
-        <w:r>
-          <w:rPr>
-            <w:color w:val="1A1A1A"/>
-            <w:sz w:val="18"/>
-          </w:rPr>
-          <w:t xml:space="preserve">vinayg1752004@gmail.com</w:t>
-        </w:r>
-      </w:hyperlink>
+    </w:p>
+    <w:p>
+      <w:pPr>
+        <w:spacing w:after="60" w:before="0" w:line="269" w:lineRule="auto"/>
+        <w:jc w:val="center"/>
+      </w:pPr>
       <w:r>
         <w:rPr>
           <w:b w:val="0"/>
-          <w:i w:val="0"/>
-          <w:color w:val="555555"/>
-          <w:sz w:val="18"/>
         </w:rPr>
-        <w:t xml:space="preserve">  |  </w:t>
+        <w:t>linkedin.com/in/-vinay-gowda | vinayg-portfolio-live.vercel.app</w:t>
       </w:r>
-      <w:hyperlink r:id="rId11">
-        <w:r>
-          <w:rPr>
-            <w:color w:val="1A1A1A"/>
-            <w:sz w:val="18"/>
-          </w:rPr>
-          <w:t xml:space="preserve">vinayg-portfolio-live.vercel.app</w:t>
-        </w:r>
-      </w:hyperlink>
-      <w:r>
-        <w:rPr>
-          <w:b w:val="0"/>
-          <w:i w:val="0"/>
-          <w:color w:val="555555"/>
-          <w:sz w:val="18"/>
-        </w:rPr>
-        <w:t xml:space="preserve">  |  </w:t>
-      </w:r>
-      <w:hyperlink r:id="rId12">
-        <w:r>
-          <w:rPr>
-            <w:color w:val="1A1A1A"/>
-            <w:sz w:val="18"/>
-          </w:rPr>
-          <w:t xml:space="preserve">github.com/VinayG759</w:t>
-        </w:r>
-      </w:hyperlink>
-      <w:r>
-        <w:rPr>
-          <w:b w:val="0"/>
-          <w:i w:val="0"/>
-          <w:color w:val="555555"/>
-          <w:sz w:val="18"/>
-        </w:rPr>
-        <w:t xml:space="preserve">  |  </w:t>
-      </w:r>
-      <w:hyperlink r:id="rId13">
-        <w:r>
-          <w:rPr>
-            <w:color w:val="1A1A1A"/>
-            <w:sz w:val="18"/>
-          </w:rPr>
-          <w:t xml:space="preserve">linkedin.com/in/-vinay-gowda</w:t>
-        </w:r>
-      </w:hyperlink>
     </w:p>
     <w:p>
       <w:pPr>
-        <w:spacing w:before="180" w:after="80"/>
+        <w:spacing w:after="100" w:before="240" w:line="269" w:lineRule="auto"/>
         <w:pBdr>
-          <w:bottom w:val="single" w:sz="6" w:space="1" w:color="9A3B1E"/>
+          <w:bottom w:val="single" w:sz="8" w:space="1" w:color="111111"/>
         </w:pBdr>
       </w:pPr>
       <w:r>
         <w:rPr>
           <w:b/>
-          <w:i w:val="0"/>
-          <w:color w:val="9A3B1E"/>
-          <w:sz w:val="20"/>
+          <w:color w:val="9A3412"/>
+          <w:sz w:val="23"/>
         </w:rPr>
         <w:t>SUMMARY</w:t>
       </w:r>
     </w:p>
     <w:p>
+      <w:pPr>
+        <w:spacing w:after="60" w:before="0" w:line="269" w:lineRule="auto"/>
+      </w:pPr>
       <w:r>
         <w:rPr>
           <w:b w:val="0"/>
-          <w:i w:val="0"/>
         </w:rPr>
-        <w:t xml:space="preserve">Computer Science undergraduate who builds AI systems and ships them to production: agents that take real actions under human approval, multi-tenant backends, and retrieval pipelines that refuse to guess. Winner of Freshworks' </w:t>
+        <w:t xml:space="preserve">AI product builder. </w:t>
       </w:r>
       <w:r>
         <w:rPr>
           <w:b/>
           <w:i w:val="0"/>
         </w:rPr>
-        <w:t>Great Agent Hackathon</w:t>
+        <w:t>Completed a 3-month internship</w:t>
       </w:r>
       <w:r>
         <w:rPr>
           <w:b w:val="0"/>
+        </w:rPr>
+        <w:t xml:space="preserve"> at Grad Skills India Private Limited, and for the </w:t>
+      </w:r>
+      <w:r>
+        <w:rPr>
+          <w:b/>
           <w:i w:val="0"/>
         </w:rPr>
-        <w:t xml:space="preserve"> (Sep 2026); sole engineer on OmniFlow AI, a live multi-channel product.</w:t>
+        <w:t>past 5 months have been building AI products</w:t>
+      </w:r>
+      <w:r>
+        <w:rPr>
+          <w:b w:val="0"/>
+        </w:rPr>
+        <w:t xml:space="preserve"> end to end: AI agents, multi-tenant backends, and the messaging and voice integrations around them. </w:t>
+      </w:r>
+      <w:r>
+        <w:rPr>
+          <w:b/>
+          <w:i w:val="0"/>
+        </w:rPr>
+        <w:t>Winner of the Freshworks Great Agent Hackathon and the GradSkills hackathon.</w:t>
+      </w:r>
+      <w:r>
+        <w:rPr>
+          <w:b w:val="0"/>
+        </w:rPr>
+        <w:t xml:space="preserve"> Sole engineer of OmniConnect AI (760+ commits, about 1,860 tests). Strong in Python, TypeScript, FastAPI, PostgreSQL and LLM tool use.</w:t>
       </w:r>
     </w:p>
     <w:p>
       <w:pPr>
-        <w:spacing w:before="180" w:after="80"/>
+        <w:spacing w:after="100" w:before="240" w:line="269" w:lineRule="auto"/>
         <w:pBdr>
-          <w:bottom w:val="single" w:sz="6" w:space="1" w:color="9A3B1E"/>
+          <w:bottom w:val="single" w:sz="8" w:space="1" w:color="111111"/>
         </w:pBdr>
       </w:pPr>
       <w:r>
         <w:rPr>
           <w:b/>
+          <w:color w:val="9A3412"/>
+          <w:sz w:val="23"/>
+        </w:rPr>
+        <w:t>EXPERIENCE</w:t>
+      </w:r>
+    </w:p>
+    <w:p>
+      <w:pPr>
+        <w:keepNext/>
+        <w:tabs>
+          <w:tab w:pos="10091" w:val="right"/>
+        </w:tabs>
+        <w:spacing w:after="40" w:before="160" w:line="269" w:lineRule="auto"/>
+      </w:pPr>
+      <w:r>
+        <w:rPr>
+          <w:b/>
+          <w:sz w:val="23"/>
+        </w:rPr>
+        <w:t>AI Product Builder | OmniConnect AI and hackathon products</w:t>
+      </w:r>
+      <w:r>
+        <w:tab/>
+        <w:t>May 2026 - Present (5+ months)</w:t>
+      </w:r>
+    </w:p>
+    <w:p>
+      <w:pPr>
+        <w:pStyle w:val="ListBullet"/>
+        <w:spacing w:after="60" w:before="0" w:line="269" w:lineRule="auto"/>
+      </w:pPr>
+      <w:r>
+        <w:rPr>
+          <w:b/>
           <w:i w:val="0"/>
-          <w:color w:val="9A3B1E"/>
-          <w:sz w:val="20"/>
+        </w:rPr>
+        <w:t>Owned products end to end:</w:t>
+      </w:r>
+      <w:r>
+        <w:rPr>
+          <w:b w:val="0"/>
+        </w:rPr>
+        <w:t xml:space="preserve"> idea, backend, dashboard, integrations, tests and documentation, working alone or in a small team.</w:t>
+      </w:r>
+    </w:p>
+    <w:p>
+      <w:pPr>
+        <w:pStyle w:val="ListBullet"/>
+        <w:spacing w:after="60" w:before="0" w:line="269" w:lineRule="auto"/>
+      </w:pPr>
+      <w:r>
+        <w:rPr>
+          <w:b/>
+          <w:i w:val="0"/>
+        </w:rPr>
+        <w:t>Built four AI products in five months</w:t>
+      </w:r>
+      <w:r>
+        <w:rPr>
+          <w:b w:val="0"/>
+        </w:rPr>
+        <w:t xml:space="preserve"> (below), including two hackathon projects.</w:t>
+      </w:r>
+    </w:p>
+    <w:p>
+      <w:pPr>
+        <w:keepNext/>
+        <w:tabs>
+          <w:tab w:pos="10091" w:val="right"/>
+        </w:tabs>
+        <w:spacing w:after="40" w:before="160" w:line="269" w:lineRule="auto"/>
+      </w:pPr>
+      <w:r>
+        <w:rPr>
+          <w:b/>
+          <w:sz w:val="23"/>
+        </w:rPr>
+        <w:t>Intern | Grad Skills India Private Limited</w:t>
+      </w:r>
+      <w:r>
+        <w:tab/>
+        <w:t>3 months (completed)</w:t>
+      </w:r>
+    </w:p>
+    <w:p>
+      <w:pPr>
+        <w:spacing w:after="100" w:before="240" w:line="269" w:lineRule="auto"/>
+        <w:pBdr>
+          <w:bottom w:val="single" w:sz="8" w:space="1" w:color="111111"/>
+        </w:pBdr>
+      </w:pPr>
+      <w:r>
+        <w:rPr>
+          <w:b/>
+          <w:color w:val="9A3412"/>
+          <w:sz w:val="23"/>
+        </w:rPr>
+        <w:t>TECHNICAL SKILLS</w:t>
+      </w:r>
+    </w:p>
+    <w:p>
+      <w:pPr>
+        <w:spacing w:after="60" w:before="0" w:line="269" w:lineRule="auto"/>
+      </w:pPr>
+      <w:r>
+        <w:rPr>
+          <w:b/>
+          <w:i w:val="0"/>
+        </w:rPr>
+        <w:t>Languages:</w:t>
+      </w:r>
+      <w:r>
+        <w:rPr>
+          <w:b w:val="0"/>
+        </w:rPr>
+        <w:t xml:space="preserve"> Python, TypeScript, JavaScript, Java, SQL</w:t>
+      </w:r>
+    </w:p>
+    <w:p>
+      <w:pPr>
+        <w:spacing w:after="60" w:before="0" w:line="269" w:lineRule="auto"/>
+      </w:pPr>
+      <w:r>
+        <w:rPr>
+          <w:b/>
+          <w:i w:val="0"/>
+        </w:rPr>
+        <w:t>AI:</w:t>
+      </w:r>
+      <w:r>
+        <w:rPr>
+          <w:b w:val="0"/>
+        </w:rPr>
+        <w:t xml:space="preserve"> LLM agents and tool use (Claude, Gemini, Gemma), OpenRouter, MCP, RAG, embeddings (fastembed), pgvector, prompt design with code-checked outputs</w:t>
+      </w:r>
+    </w:p>
+    <w:p>
+      <w:pPr>
+        <w:spacing w:after="60" w:before="0" w:line="269" w:lineRule="auto"/>
+      </w:pPr>
+      <w:r>
+        <w:rPr>
+          <w:b/>
+          <w:i w:val="0"/>
+        </w:rPr>
+        <w:t>Backend:</w:t>
+      </w:r>
+      <w:r>
+        <w:rPr>
+          <w:b w:val="0"/>
+        </w:rPr>
+        <w:t xml:space="preserve"> FastAPI, Node.js, SQLAlchemy, Alembic, REST, webhooks, Server-Sent Events, GitHub Actions CI, pytest, Vitest, Playwright</w:t>
+      </w:r>
+    </w:p>
+    <w:p>
+      <w:pPr>
+        <w:spacing w:after="60" w:before="0" w:line="269" w:lineRule="auto"/>
+      </w:pPr>
+      <w:r>
+        <w:rPr>
+          <w:b/>
+          <w:i w:val="0"/>
+        </w:rPr>
+        <w:t>Data and Infra:</w:t>
+      </w:r>
+      <w:r>
+        <w:rPr>
+          <w:b w:val="0"/>
+        </w:rPr>
+        <w:t xml:space="preserve"> PostgreSQL (row-level security), Supabase, MySQL, MongoDB, AWS (S3, DynamoDB), Docker, Kubernetes, Prometheus, Railway, Vercel</w:t>
+      </w:r>
+    </w:p>
+    <w:p>
+      <w:pPr>
+        <w:spacing w:after="60" w:before="0" w:line="269" w:lineRule="auto"/>
+      </w:pPr>
+      <w:r>
+        <w:rPr>
+          <w:b/>
+          <w:i w:val="0"/>
+        </w:rPr>
+        <w:t>Frontend:</w:t>
+      </w:r>
+      <w:r>
+        <w:rPr>
+          <w:b w:val="0"/>
+        </w:rPr>
+        <w:t xml:space="preserve"> Next.js, React, Tailwind CSS, shadcn/ui, TanStack Query, Leaflet maps</w:t>
+      </w:r>
+    </w:p>
+    <w:p>
+      <w:pPr>
+        <w:spacing w:after="60" w:before="0" w:line="269" w:lineRule="auto"/>
+      </w:pPr>
+      <w:r>
+        <w:rPr>
+          <w:b/>
+          <w:i w:val="0"/>
+        </w:rPr>
+        <w:t>Integrations:</w:t>
+      </w:r>
+      <w:r>
+        <w:rPr>
+          <w:b w:val="0"/>
+        </w:rPr>
+        <w:t xml:space="preserve"> WhatsApp Cloud API, Facebook Messenger and Instagram (Meta Graph API), Telegram Bot API, Gmail and SMTP email, Google Sheets API, Vobiz and Plivo voice calling, Sarvam and ElevenLabs speech, Freshservice, Clerk auth</w:t>
+      </w:r>
+    </w:p>
+    <w:p>
+      <w:pPr>
+        <w:spacing w:after="100" w:before="240" w:line="269" w:lineRule="auto"/>
+        <w:pBdr>
+          <w:bottom w:val="single" w:sz="8" w:space="1" w:color="111111"/>
+        </w:pBdr>
+      </w:pPr>
+      <w:r>
+        <w:rPr>
+          <w:b/>
+          <w:color w:val="9A3412"/>
+          <w:sz w:val="23"/>
+        </w:rPr>
+        <w:t>PROJECTS</w:t>
+      </w:r>
+    </w:p>
+    <w:p>
+      <w:pPr>
+        <w:keepNext/>
+        <w:tabs>
+          <w:tab w:pos="10091" w:val="right"/>
+        </w:tabs>
+        <w:spacing w:after="40" w:before="160" w:line="269" w:lineRule="auto"/>
+      </w:pPr>
+      <w:r>
+        <w:rPr>
+          <w:b/>
+          <w:sz w:val="23"/>
+        </w:rPr>
+        <w:t>OmniConnect AI | One inbox for every customer conversation, AI answers first</w:t>
+      </w:r>
+      <w:r>
+        <w:tab/>
+        <w:t>May - Oct 2026</w:t>
+      </w:r>
+    </w:p>
+    <w:p>
+      <w:pPr>
+        <w:keepNext/>
+        <w:tabs>
+          <w:tab w:pos="10091" w:val="right"/>
+        </w:tabs>
+        <w:spacing w:after="40" w:before="160" w:line="269" w:lineRule="auto"/>
+      </w:pPr>
+      <w:r>
+        <w:rPr>
+          <w:b/>
+          <w:sz w:val="23"/>
+        </w:rPr>
+        <w:t>SentinelOps AI | AI SRE agent with human-approved fixes</w:t>
+      </w:r>
+      <w:r>
+        <w:tab/>
+        <w:t>Winner, Freshworks | Sep 2026</w:t>
+      </w:r>
+    </w:p>
+    <w:p>
+      <w:pPr>
+        <w:keepNext/>
+        <w:tabs>
+          <w:tab w:pos="10091" w:val="right"/>
+        </w:tabs>
+        <w:spacing w:after="40" w:before="160" w:line="269" w:lineRule="auto"/>
+      </w:pPr>
+      <w:r>
+        <w:rPr>
+          <w:b/>
+          <w:sz w:val="23"/>
+        </w:rPr>
+        <w:t>Fastforward | Flight simulator for PayPal Subscriptions</w:t>
+      </w:r>
+      <w:r>
+        <w:tab/>
+        <w:t>Oct 2026 | In progress</w:t>
+      </w:r>
+    </w:p>
+    <w:p>
+      <w:pPr>
+        <w:keepNext/>
+        <w:tabs>
+          <w:tab w:pos="10091" w:val="right"/>
+        </w:tabs>
+        <w:spacing w:after="40" w:before="160" w:line="269" w:lineRule="auto"/>
+      </w:pPr>
+      <w:r>
+        <w:rPr>
+          <w:b/>
+          <w:sz w:val="23"/>
+        </w:rPr>
+        <w:t>Sangam | Citizen reports joined with public data</w:t>
+      </w:r>
+      <w:r>
+        <w:tab/>
+        <w:t>sangam-eight-blue.vercel.app</w:t>
+      </w:r>
+    </w:p>
+    <w:p>
+      <w:pPr>
+        <w:spacing w:after="100" w:before="240" w:line="269" w:lineRule="auto"/>
+        <w:pBdr>
+          <w:bottom w:val="single" w:sz="8" w:space="1" w:color="111111"/>
+        </w:pBdr>
+      </w:pPr>
+      <w:r>
+        <w:rPr>
+          <w:b/>
+          <w:color w:val="9A3412"/>
+          <w:sz w:val="23"/>
+        </w:rPr>
+        <w:t>ACHIEVEMENTS</w:t>
+      </w:r>
+    </w:p>
+    <w:p>
+      <w:pPr>
+        <w:pStyle w:val="ListBullet"/>
+        <w:spacing w:after="60" w:before="0" w:line="269" w:lineRule="auto"/>
+      </w:pPr>
+      <w:r>
+        <w:rPr>
+          <w:b/>
+          <w:i w:val="0"/>
+        </w:rPr>
+        <w:t>Winner,</w:t>
+      </w:r>
+      <w:r>
+        <w:rPr>
+          <w:b w:val="0"/>
+        </w:rPr>
+        <w:t xml:space="preserve"> The Great Agent Hackathon, Freshworks, Bengaluru (25-26 Sep 2026), Track 3: AI-native Enterprise, with SentinelOps AI.</w:t>
+      </w:r>
+    </w:p>
+    <w:p>
+      <w:pPr>
+        <w:pStyle w:val="ListBullet"/>
+        <w:spacing w:after="60" w:before="0" w:line="269" w:lineRule="auto"/>
+      </w:pPr>
+      <w:r>
+        <w:rPr>
+          <w:b/>
+          <w:i w:val="0"/>
+        </w:rPr>
+        <w:t>Winner,</w:t>
+      </w:r>
+      <w:r>
+        <w:rPr>
+          <w:b w:val="0"/>
+        </w:rPr>
+        <w:t xml:space="preserve"> GradSkills Compete and Win: Summership 2026 (OmniConnect AI began at its SummerShip Challenge).</w:t>
+      </w:r>
+    </w:p>
+    <w:p>
+      <w:pPr>
+        <w:pStyle w:val="ListBullet"/>
+        <w:spacing w:after="60" w:before="0" w:line="269" w:lineRule="auto"/>
+      </w:pPr>
+      <w:r>
+        <w:rPr>
+          <w:b/>
+          <w:i w:val="0"/>
+        </w:rPr>
+        <w:t>Completed a 3-month internship</w:t>
+      </w:r>
+      <w:r>
+        <w:rPr>
+          <w:b w:val="0"/>
+        </w:rPr>
+        <w:t xml:space="preserve"> at Grad Skills India Private Limited.</w:t>
+      </w:r>
+    </w:p>
+    <w:p>
+      <w:pPr>
+        <w:pStyle w:val="ListBullet"/>
+        <w:spacing w:after="60" w:before="0" w:line="269" w:lineRule="auto"/>
+      </w:pPr>
+      <w:r>
+        <w:rPr>
+          <w:b/>
+          <w:i w:val="0"/>
+        </w:rPr>
+        <w:t>Certificate:</w:t>
+      </w:r>
+      <w:r>
+        <w:rPr>
+          <w:b w:val="0"/>
+        </w:rPr>
+        <w:t xml:space="preserve"> be10x AI Tools Workshop (Mar 2026).</w:t>
+      </w:r>
+    </w:p>
+    <w:p>
+      <w:pPr>
+        <w:spacing w:after="100" w:before="240" w:line="269" w:lineRule="auto"/>
+        <w:pBdr>
+          <w:bottom w:val="single" w:sz="8" w:space="1" w:color="111111"/>
+        </w:pBdr>
+      </w:pPr>
+      <w:r>
+        <w:rPr>
+          <w:b/>
+          <w:color w:val="9A3412"/>
+          <w:sz w:val="23"/>
         </w:rPr>
         <w:t>EDUCATION</w:t>
       </w:r>
     </w:p>
     <w:p>
       <w:pPr>
+        <w:keepNext/>
         <w:tabs>
-          <w:tab w:pos="10512" w:val="right"/>
+          <w:tab w:pos="10091" w:val="right"/>
         </w:tabs>
+        <w:spacing w:after="40" w:before="160" w:line="269" w:lineRule="auto"/>
+      </w:pPr>
+      <w:r>
+        <w:rPr>
+          <w:b/>
+          <w:sz w:val="23"/>
+        </w:rPr>
+        <w:t>B.Tech, Computer Science, Presidency University, Bengaluru</w:t>
+      </w:r>
+      <w:r>
+        <w:tab/>
+        <w:t>2024 - 2028</w:t>
+      </w:r>
+    </w:p>
+    <w:p>
+      <w:pPr>
+        <w:spacing w:after="60" w:before="0" w:line="269" w:lineRule="auto"/>
       </w:pPr>
       <w:r>
         <w:rPr>
           <w:b/>
           <w:i w:val="0"/>
         </w:rPr>
-        <w:t>B.Tech, Computer Science</w:t>
+        <w:t>Spoken languages:</w:t>
       </w:r>
       <w:r>
         <w:rPr>
           <w:b w:val="0"/>
-          <w:i w:val="0"/>
         </w:rPr>
-        <w:t xml:space="preserve">  —  Presidency University, Bengaluru</w:t>
-      </w:r>
-      <w:r>
-        <w:rPr>
-          <w:b w:val="0"/>
-          <w:i w:val="0"/>
-          <w:color w:val="555555"/>
-        </w:rPr>
-        <w:tab/>
-        <w:t>2024 – 2028</w:t>
-      </w:r>
-    </w:p>
-    <w:p>
-      <w:pPr>
-        <w:spacing w:before="180" w:after="80"/>
-        <w:pBdr>
-          <w:bottom w:val="single" w:sz="6" w:space="1" w:color="9A3B1E"/>
-        </w:pBdr>
-      </w:pPr>
-      <w:r>
-        <w:rPr>
-          <w:b/>
-          <w:i w:val="0"/>
-          <w:color w:val="9A3B1E"/>
-          <w:sz w:val="20"/>
-        </w:rPr>
-        <w:t>ACHIEVEMENTS</w:t>
-      </w:r>
-    </w:p>
-    <w:p>
-      <w:pPr>
-        <w:spacing w:after="36"/>
-        <w:ind w:left="230" w:hanging="173"/>
-      </w:pPr>
-      <w:r>
-        <w:rPr>
-          <w:b w:val="0"/>
-          <w:i w:val="0"/>
-        </w:rPr>
-        <w:t xml:space="preserve">•  </w:t>
-      </w:r>
-      <w:r>
-        <w:rPr>
-          <w:b w:val="0"/>
-          <w:i w:val="0"/>
-        </w:rPr>
-      </w:r>
-      <w:r>
-        <w:rPr>
-          <w:b/>
-          <w:i w:val="0"/>
-        </w:rPr>
-        <w:t>Winner — The Great Agent Hackathon, Freshworks</w:t>
-      </w:r>
-      <w:r>
-        <w:rPr>
-          <w:b w:val="0"/>
-          <w:i w:val="0"/>
-        </w:rPr>
-        <w:t xml:space="preserve"> (Bengaluru, 25–26 Sep 2026), Track 3: AI-native Enterprise, with SentinelOps AI.</w:t>
-      </w:r>
-    </w:p>
-    <w:p>
-      <w:pPr>
-        <w:spacing w:after="36"/>
-        <w:ind w:left="230" w:hanging="173"/>
-      </w:pPr>
-      <w:r>
-        <w:rPr>
-          <w:b w:val="0"/>
-          <w:i w:val="0"/>
-        </w:rPr>
-        <w:t xml:space="preserve">•  </w:t>
-      </w:r>
-      <w:r>
-        <w:rPr>
-          <w:b w:val="0"/>
-          <w:i w:val="0"/>
-        </w:rPr>
-        <w:t>Cleared Round 1, GradSkills Compete &amp; Win: Summership 2026 (May 2026)  ·  be10x AI Tools Workshop certificate (Mar 2026).</w:t>
-      </w:r>
-    </w:p>
-    <w:p>
-      <w:pPr>
-        <w:spacing w:before="180" w:after="80"/>
-        <w:pBdr>
-          <w:bottom w:val="single" w:sz="6" w:space="1" w:color="9A3B1E"/>
-        </w:pBdr>
-      </w:pPr>
-      <w:r>
-        <w:rPr>
-          <w:b/>
-          <w:i w:val="0"/>
-          <w:color w:val="9A3B1E"/>
-          <w:sz w:val="20"/>
-        </w:rPr>
-        <w:t>PROJECTS</w:t>
-      </w:r>
-    </w:p>
-    <w:p>
-      <w:pPr>
-        <w:tabs>
-          <w:tab w:pos="10512" w:val="right"/>
-        </w:tabs>
-        <w:spacing w:before="100"/>
-      </w:pPr>
-      <w:r>
-        <w:rPr>
-          <w:b/>
-          <w:i w:val="0"/>
-          <w:sz w:val="21"/>
-        </w:rPr>
-        <w:t>SentinelOps AI</w:t>
-      </w:r>
-      <w:r>
-        <w:rPr>
-          <w:b w:val="0"/>
-          <w:i w:val="0"/>
-          <w:color w:val="555555"/>
-        </w:rPr>
-        <w:t xml:space="preserve">  |  AI SRE agent with human-approved remediation</w:t>
-      </w:r>
-      <w:r>
-        <w:rPr>
-          <w:b w:val="0"/>
-          <w:i w:val="0"/>
-        </w:rPr>
-        <w:tab/>
-      </w:r>
-      <w:r>
-        <w:rPr>
-          <w:b w:val="0"/>
-          <w:i w:val="0"/>
-          <w:color w:val="555555"/>
-        </w:rPr>
-        <w:t>Winner · Freshworks</w:t>
-      </w:r>
-    </w:p>
-    <w:p>
-      <w:pPr>
-        <w:spacing w:after="50"/>
-      </w:pPr>
-      <w:r>
-        <w:rPr>
-          <w:b w:val="0"/>
-          <w:i/>
-          <w:color w:val="555555"/>
-          <w:sz w:val="18"/>
-        </w:rPr>
-        <w:t>Python · FastAPI · Claude (tool use) · Kubernetes · Prometheus · Supabase · Freshservice API + MCP · React</w:t>
-      </w:r>
-    </w:p>
-    <w:p>
-      <w:pPr>
-        <w:spacing w:after="36"/>
-        <w:ind w:left="230" w:hanging="173"/>
-      </w:pPr>
-      <w:r>
-        <w:rPr>
-          <w:b w:val="0"/>
-          <w:i w:val="0"/>
-        </w:rPr>
-        <w:t xml:space="preserve">•  </w:t>
-      </w:r>
-      <w:r>
-        <w:rPr>
-          <w:b w:val="0"/>
-          <w:i w:val="0"/>
-        </w:rPr>
-        <w:t xml:space="preserve">Detects Kubernetes incidents from Prometheus error ratios every 15 s, then investigates with Claude in a bounded tool-use loop over </w:t>
-      </w:r>
-      <w:r>
-        <w:rPr>
-          <w:b/>
-          <w:i w:val="0"/>
-        </w:rPr>
-        <w:t>9 read-only tools</w:t>
-      </w:r>
-      <w:r>
-        <w:rPr>
-          <w:b w:val="0"/>
-          <w:i w:val="0"/>
-        </w:rPr>
-        <w:t xml:space="preserve"> (≤14 calls, ~$0.05 per investigation); conclusions that don't cite evidence are rejected.</w:t>
-      </w:r>
-    </w:p>
-    <w:p>
-      <w:pPr>
-        <w:spacing w:after="36"/>
-        <w:ind w:left="230" w:hanging="173"/>
-      </w:pPr>
-      <w:r>
-        <w:rPr>
-          <w:b w:val="0"/>
-          <w:i w:val="0"/>
-        </w:rPr>
-        <w:t xml:space="preserve">•  </w:t>
-      </w:r>
-      <w:r>
-        <w:rPr>
-          <w:b w:val="0"/>
-          <w:i w:val="0"/>
-        </w:rPr>
-        <w:t xml:space="preserve">Every fix becomes a </w:t>
-      </w:r>
-      <w:r>
-        <w:rPr>
-          <w:b/>
-          <w:i w:val="0"/>
-        </w:rPr>
-        <w:t>Freshservice change request</w:t>
-      </w:r>
-      <w:r>
-        <w:rPr>
-          <w:b w:val="0"/>
-          <w:i w:val="0"/>
-        </w:rPr>
-        <w:t xml:space="preserve"> and runs only after human approval, chosen from a fixed 4-action catalog through a least-privilege ServiceAccount that cannot create, delete or read secrets; verifies recovery for 2 min and </w:t>
-      </w:r>
-      <w:r>
-        <w:rPr>
-          <w:b/>
-          <w:i w:val="0"/>
-        </w:rPr>
-        <w:t>rolls back automatically</w:t>
-      </w:r>
-      <w:r>
-        <w:rPr>
-          <w:b w:val="0"/>
-          <w:i w:val="0"/>
-        </w:rPr>
-        <w:t>.</w:t>
-      </w:r>
-    </w:p>
-    <w:p>
-      <w:pPr>
-        <w:spacing w:after="36"/>
-        <w:ind w:left="230" w:hanging="173"/>
-      </w:pPr>
-      <w:r>
-        <w:rPr>
-          <w:b w:val="0"/>
-          <w:i w:val="0"/>
-        </w:rPr>
-        <w:t xml:space="preserve">•  </w:t>
-      </w:r>
-      <w:r>
-        <w:rPr>
-          <w:b w:val="0"/>
-          <w:i w:val="0"/>
-        </w:rPr>
-        <w:t xml:space="preserve">Tamper-evident, </w:t>
-      </w:r>
-      <w:r>
-        <w:rPr>
-          <w:b/>
-          <w:i w:val="0"/>
-        </w:rPr>
-        <w:t>hash-chained audit log</w:t>
-      </w:r>
-      <w:r>
-        <w:rPr>
-          <w:b w:val="0"/>
-          <w:i w:val="0"/>
-        </w:rPr>
-        <w:t xml:space="preserve"> in Postgres; phones the on-call engineer via Vobiz + Sarvam voice.</w:t>
-      </w:r>
-    </w:p>
-    <w:p>
-      <w:pPr>
-        <w:tabs>
-          <w:tab w:pos="10512" w:val="right"/>
-        </w:tabs>
-        <w:spacing w:before="100"/>
-      </w:pPr>
-      <w:r>
-        <w:rPr>
-          <w:b/>
-          <w:i w:val="0"/>
-          <w:sz w:val="21"/>
-        </w:rPr>
-        <w:t>OmniFlow AI</w:t>
-      </w:r>
-      <w:r>
-        <w:rPr>
-          <w:b w:val="0"/>
-          <w:i w:val="0"/>
-          <w:color w:val="555555"/>
-        </w:rPr>
-        <w:t xml:space="preserve">  |  Multi-channel AI customer-communication platform</w:t>
-      </w:r>
-      <w:r>
-        <w:rPr>
-          <w:b w:val="0"/>
-          <w:i w:val="0"/>
-        </w:rPr>
-        <w:tab/>
-      </w:r>
-      <w:hyperlink r:id="rId14">
-        <w:r>
-          <w:rPr>
-            <w:color w:val="9A3B1E"/>
-          </w:rPr>
-          <w:t xml:space="preserve">omni-flow-ai.vercel.app</w:t>
-        </w:r>
-      </w:hyperlink>
-    </w:p>
-    <w:p>
-      <w:pPr>
-        <w:spacing w:after="50"/>
-      </w:pPr>
-      <w:r>
-        <w:rPr>
-          <w:b w:val="0"/>
-          <w:i/>
-          <w:color w:val="555555"/>
-          <w:sz w:val="18"/>
-        </w:rPr>
-        <w:t>Next.js · React · FastAPI · SQLAlchemy/Alembic · Supabase Postgres · Groq LLMs · Meta Graph API · Plivo · Clerk</w:t>
-      </w:r>
-    </w:p>
-    <w:p>
-      <w:pPr>
-        <w:spacing w:after="36"/>
-        <w:ind w:left="230" w:hanging="173"/>
-      </w:pPr>
-      <w:r>
-        <w:rPr>
-          <w:b w:val="0"/>
-          <w:i w:val="0"/>
-        </w:rPr>
-        <w:t xml:space="preserve">•  </w:t>
-      </w:r>
-      <w:r>
-        <w:rPr>
-          <w:b w:val="0"/>
-          <w:i w:val="0"/>
-        </w:rPr>
-        <w:t xml:space="preserve">Built and run solo in production: </w:t>
-      </w:r>
-      <w:r>
-        <w:rPr>
-          <w:b/>
-          <w:i w:val="0"/>
-        </w:rPr>
-        <w:t>750+ commits, 1,500+ backend tests</w:t>
-      </w:r>
-      <w:r>
-        <w:rPr>
-          <w:b w:val="0"/>
-          <w:i w:val="0"/>
-        </w:rPr>
-        <w:t>. WhatsApp, Messenger, Instagram, email and a web widget flow into one inbox, with AI replies grounded in each business's knowledge base and refusals when no source supports an answer.</w:t>
-      </w:r>
-    </w:p>
-    <w:p>
-      <w:pPr>
-        <w:spacing w:after="36"/>
-        <w:ind w:left="230" w:hanging="173"/>
-      </w:pPr>
-      <w:r>
-        <w:rPr>
-          <w:b w:val="0"/>
-          <w:i w:val="0"/>
-        </w:rPr>
-        <w:t xml:space="preserve">•  </w:t>
-      </w:r>
-      <w:r>
-        <w:rPr>
-          <w:b w:val="0"/>
-          <w:i w:val="0"/>
-        </w:rPr>
-        <w:t xml:space="preserve">Multi-tenant data isolation with </w:t>
-      </w:r>
-      <w:r>
-        <w:rPr>
-          <w:b/>
-          <w:i w:val="0"/>
-        </w:rPr>
-        <w:t>Postgres row-level security</w:t>
-      </w:r>
-      <w:r>
-        <w:rPr>
-          <w:b w:val="0"/>
-          <w:i w:val="0"/>
-        </w:rPr>
-        <w:t xml:space="preserve"> under a non-superuser role; diagnosed pooler-mode tenant-context loss and moved to session pooling; migrated production to Supabase.</w:t>
-      </w:r>
-    </w:p>
-    <w:p>
-      <w:pPr>
-        <w:spacing w:after="36"/>
-        <w:ind w:left="230" w:hanging="173"/>
-      </w:pPr>
-      <w:r>
-        <w:rPr>
-          <w:b w:val="0"/>
-          <w:i w:val="0"/>
-        </w:rPr>
-        <w:t xml:space="preserve">•  </w:t>
-      </w:r>
-      <w:r>
-        <w:rPr>
-          <w:b w:val="0"/>
-          <w:i w:val="0"/>
-        </w:rPr>
-        <w:t xml:space="preserve">AI voice agent on Plivo that </w:t>
-      </w:r>
-      <w:r>
-        <w:rPr>
-          <w:b/>
-          <w:i w:val="0"/>
-        </w:rPr>
-        <w:t>transfers live calls into a human agent's browser</w:t>
-      </w:r>
-      <w:r>
-        <w:rPr>
-          <w:b w:val="0"/>
-          <w:i w:val="0"/>
-        </w:rPr>
-        <w:t>, with signed webhooks and durable call audio; plus leads pipeline, AI form builder, bookings and Google Sheets sync.</w:t>
-      </w:r>
-    </w:p>
-    <w:p>
-      <w:pPr>
-        <w:tabs>
-          <w:tab w:pos="10512" w:val="right"/>
-        </w:tabs>
-        <w:spacing w:before="100"/>
-      </w:pPr>
-      <w:r>
-        <w:rPr>
-          <w:b/>
-          <w:i w:val="0"/>
-          <w:sz w:val="21"/>
-        </w:rPr>
-        <w:t>Sangam</w:t>
-      </w:r>
-      <w:r>
-        <w:rPr>
-          <w:b w:val="0"/>
-          <w:i w:val="0"/>
-          <w:color w:val="555555"/>
-        </w:rPr>
-        <w:t xml:space="preserve">  |  Citizen voice joined with public data</w:t>
-      </w:r>
-      <w:r>
-        <w:rPr>
-          <w:b w:val="0"/>
-          <w:i w:val="0"/>
-        </w:rPr>
-        <w:tab/>
-      </w:r>
-      <w:hyperlink r:id="rId15">
-        <w:r>
-          <w:rPr>
-            <w:color w:val="9A3B1E"/>
-          </w:rPr>
-          <w:t xml:space="preserve">sangam-eight-blue.vercel.app</w:t>
-        </w:r>
-      </w:hyperlink>
-    </w:p>
-    <w:p>
-      <w:pPr>
-        <w:spacing w:after="50"/>
-      </w:pPr>
-      <w:r>
-        <w:rPr>
-          <w:b w:val="0"/>
-          <w:i/>
-          <w:color w:val="555555"/>
-          <w:sz w:val="18"/>
-        </w:rPr>
-        <w:t>FastAPI · Supabase (pgvector, PostGIS) · Gemini · Sarvam · React · Leaflet · Telegram/WhatsApp · Google Cloud Build with AI</w:t>
-      </w:r>
-    </w:p>
-    <w:p>
-      <w:pPr>
-        <w:spacing w:after="36"/>
-        <w:ind w:left="230" w:hanging="173"/>
-      </w:pPr>
-      <w:r>
-        <w:rPr>
-          <w:b w:val="0"/>
-          <w:i w:val="0"/>
-        </w:rPr>
-        <w:t xml:space="preserve">•  </w:t>
-      </w:r>
-      <w:r>
-        <w:rPr>
-          <w:b w:val="0"/>
-          <w:i w:val="0"/>
-        </w:rPr>
-        <w:t xml:space="preserve">Takes multilingual voice, photo and text reports over Telegram, WhatsApp and web; groups them by place and need, and </w:t>
-      </w:r>
-      <w:r>
-        <w:rPr>
-          <w:b/>
-          <w:i w:val="0"/>
-        </w:rPr>
-        <w:t>joins them with official statistics</w:t>
-      </w:r>
-      <w:r>
-        <w:rPr>
-          <w:b w:val="0"/>
-          <w:i w:val="0"/>
-        </w:rPr>
-        <w:t xml:space="preserve"> (Jal Jeevan Mission tap coverage, 30 districts / 228 blocks of Karnataka) to flag delivery gaps.</w:t>
-      </w:r>
-    </w:p>
-    <w:p>
-      <w:pPr>
-        <w:spacing w:after="36"/>
-        <w:ind w:left="230" w:hanging="173"/>
-      </w:pPr>
-      <w:r>
-        <w:rPr>
-          <w:b w:val="0"/>
-          <w:i w:val="0"/>
-        </w:rPr>
-        <w:t xml:space="preserve">•  </w:t>
-      </w:r>
-      <w:r>
-        <w:rPr>
-          <w:b w:val="0"/>
-          <w:i w:val="0"/>
-        </w:rPr>
-        <w:t xml:space="preserve">Ranking is plain arithmetic; Gemini only explains, and </w:t>
-      </w:r>
-      <w:r>
-        <w:rPr>
-          <w:b/>
-          <w:i w:val="0"/>
-        </w:rPr>
-        <w:t>code rejects any AI-written number</w:t>
-      </w:r>
-      <w:r>
-        <w:rPr>
-          <w:b w:val="0"/>
-          <w:i w:val="0"/>
-        </w:rPr>
-        <w:t xml:space="preserve"> not in the sourced facts.</w:t>
-      </w:r>
-    </w:p>
-    <w:p>
-      <w:pPr>
-        <w:spacing w:after="36"/>
-        <w:ind w:left="230" w:hanging="173"/>
-      </w:pPr>
-      <w:r>
-        <w:rPr>
-          <w:b w:val="0"/>
-          <w:i w:val="0"/>
-        </w:rPr>
-        <w:t xml:space="preserve">•  </w:t>
-      </w:r>
-      <w:r>
-        <w:rPr>
-          <w:b w:val="0"/>
-          <w:i w:val="0"/>
-        </w:rPr>
-        <w:t>Privacy by design: reporter identities stored only as keyed hashes, personal details stripped, and groups of fewer than 5 people never shown.</w:t>
-      </w:r>
-    </w:p>
-    <w:p>
-      <w:pPr>
-        <w:tabs>
-          <w:tab w:pos="10512" w:val="right"/>
-        </w:tabs>
-        <w:spacing w:before="100"/>
-      </w:pPr>
-      <w:r>
-        <w:rPr>
-          <w:b/>
-          <w:i w:val="0"/>
-          <w:sz w:val="21"/>
-        </w:rPr>
-        <w:t>Baseline</w:t>
-      </w:r>
-      <w:r>
-        <w:rPr>
-          <w:b w:val="0"/>
-          <w:i w:val="0"/>
-          <w:color w:val="555555"/>
-        </w:rPr>
-        <w:t xml:space="preserve">  |  Lab-report history that notices trends</w:t>
-      </w:r>
-      <w:r>
-        <w:rPr>
-          <w:b w:val="0"/>
-          <w:i w:val="0"/>
-        </w:rPr>
-        <w:tab/>
-      </w:r>
-      <w:r>
-        <w:rPr>
-          <w:b w:val="0"/>
-          <w:i w:val="0"/>
-          <w:color w:val="555555"/>
-        </w:rPr>
-        <w:t>AWS × WeMakeDevs</w:t>
-      </w:r>
-    </w:p>
-    <w:p>
-      <w:pPr>
-        <w:spacing w:after="50"/>
-      </w:pPr>
-      <w:r>
-        <w:rPr>
-          <w:b w:val="0"/>
-          <w:i/>
-          <w:color w:val="555555"/>
-          <w:sz w:val="18"/>
-        </w:rPr>
-        <w:t>Python · AWS S3 · DynamoDB · Strands Agents · Gemini · PWA · English / Kannada / Hindi</w:t>
-      </w:r>
-    </w:p>
-    <w:p>
-      <w:pPr>
-        <w:spacing w:after="36"/>
-        <w:ind w:left="230" w:hanging="173"/>
-      </w:pPr>
-      <w:r>
-        <w:rPr>
-          <w:b w:val="0"/>
-          <w:i w:val="0"/>
-        </w:rPr>
-        <w:t xml:space="preserve">•  </w:t>
-      </w:r>
-      <w:r>
-        <w:rPr>
-          <w:b w:val="0"/>
-          <w:i w:val="0"/>
-        </w:rPr>
-        <w:t xml:space="preserve">Photo of a lab report → model extracts values → tested Python computes trends → plain-language summary in 3 languages. Design rule: </w:t>
-      </w:r>
-      <w:r>
-        <w:rPr>
-          <w:b/>
-          <w:i w:val="0"/>
-        </w:rPr>
-        <w:t>the model reads, code decides, the model explains</w:t>
-      </w:r>
-      <w:r>
-        <w:rPr>
-          <w:b w:val="0"/>
-          <w:i w:val="0"/>
-        </w:rPr>
-        <w:t>. 320+ tests; built in 48 h with a teammate against a versioned API contract.</w:t>
-      </w:r>
-    </w:p>
-    <w:p>
-      <w:pPr>
-        <w:spacing w:before="180" w:after="80"/>
-        <w:pBdr>
-          <w:bottom w:val="single" w:sz="6" w:space="1" w:color="9A3B1E"/>
-        </w:pBdr>
-      </w:pPr>
-      <w:r>
-        <w:rPr>
-          <w:b/>
-          <w:i w:val="0"/>
-          <w:color w:val="9A3B1E"/>
-          <w:sz w:val="20"/>
-        </w:rPr>
-        <w:t>TECHNICAL SKILLS</w:t>
-      </w:r>
-    </w:p>
-    <w:p>
-      <w:pPr>
-        <w:spacing w:after="50"/>
-      </w:pPr>
-      <w:r>
-        <w:rPr>
-          <w:b/>
-          <w:i w:val="0"/>
-        </w:rPr>
-        <w:t xml:space="preserve">Languages: </w:t>
-      </w:r>
-      <w:r>
-        <w:rPr>
-          <w:b w:val="0"/>
-          <w:i w:val="0"/>
-        </w:rPr>
-        <w:t>Python, TypeScript, JavaScript, Java, SQL</w:t>
-      </w:r>
-    </w:p>
-    <w:p>
-      <w:pPr>
-        <w:spacing w:after="50"/>
-      </w:pPr>
-      <w:r>
-        <w:rPr>
-          <w:b/>
-          <w:i w:val="0"/>
-        </w:rPr>
-        <w:t xml:space="preserve">AI / ML: </w:t>
-      </w:r>
-      <w:r>
-        <w:rPr>
-          <w:b w:val="0"/>
-          <w:i w:val="0"/>
-        </w:rPr>
-        <w:t>LLM agents &amp; tool use (Claude, Gemini, Groq), MCP, RAG, pgvector, prompt design with code-checked outputs</w:t>
-      </w:r>
-    </w:p>
-    <w:p>
-      <w:pPr>
-        <w:spacing w:after="50"/>
-      </w:pPr>
-      <w:r>
-        <w:rPr>
-          <w:b/>
-          <w:i w:val="0"/>
-        </w:rPr>
-        <w:t xml:space="preserve">Backend: </w:t>
-      </w:r>
-      <w:r>
-        <w:rPr>
-          <w:b w:val="0"/>
-          <w:i w:val="0"/>
-        </w:rPr>
-        <w:t>FastAPI, SQLAlchemy, Alembic, Node.js, Express, Spring Boot, REST, webhooks, pytest</w:t>
-      </w:r>
-    </w:p>
-    <w:p>
-      <w:pPr>
-        <w:spacing w:after="50"/>
-      </w:pPr>
-      <w:r>
-        <w:rPr>
-          <w:b/>
-          <w:i w:val="0"/>
-        </w:rPr>
-        <w:t xml:space="preserve">Data &amp; Infra: </w:t>
-      </w:r>
-      <w:r>
-        <w:rPr>
-          <w:b w:val="0"/>
-          <w:i w:val="0"/>
-        </w:rPr>
-        <w:t>PostgreSQL (row-level security), Supabase, MySQL, MongoDB, Docker, Kubernetes, Prometheus, AWS (S3, DynamoDB), Vercel, Render, Railway</w:t>
-      </w:r>
-    </w:p>
-    <w:p>
-      <w:pPr>
-        <w:spacing w:after="50"/>
-      </w:pPr>
-      <w:r>
-        <w:rPr>
-          <w:b/>
-          <w:i w:val="0"/>
-        </w:rPr>
-        <w:t xml:space="preserve">Frontend: </w:t>
-      </w:r>
-      <w:r>
-        <w:rPr>
-          <w:b w:val="0"/>
-          <w:i w:val="0"/>
-        </w:rPr>
-        <w:t>React, Next.js, Tailwind CSS, shadcn/ui, TanStack Query</w:t>
-      </w:r>
-    </w:p>
-    <w:p>
-      <w:r>
-        <w:rPr>
-          <w:b/>
-          <w:i w:val="0"/>
-        </w:rPr>
-        <w:t xml:space="preserve">Profiles: </w:t>
-      </w:r>
-      <w:hyperlink r:id="rId16">
-        <w:r>
-          <w:rPr>
-            <w:color w:val="1A1A1A"/>
-          </w:rPr>
-          <w:t xml:space="preserve">LeetCode</w:t>
-        </w:r>
-      </w:hyperlink>
-      <w:r>
-        <w:rPr>
-          <w:b w:val="0"/>
-          <w:i w:val="0"/>
-        </w:rPr>
-        <w:t xml:space="preserve">  ·  </w:t>
-      </w:r>
-      <w:hyperlink r:id="rId17">
-        <w:r>
-          <w:rPr>
-            <w:color w:val="1A1A1A"/>
-          </w:rPr>
-          <w:t xml:space="preserve">HackerRank</w:t>
-        </w:r>
-      </w:hyperlink>
-      <w:r>
-        <w:rPr>
-          <w:b/>
-          <w:i w:val="0"/>
-        </w:rPr>
-        <w:t xml:space="preserve">     Spoken: </w:t>
-      </w:r>
-      <w:r>
-        <w:rPr>
-          <w:b w:val="0"/>
-          <w:i w:val="0"/>
-        </w:rPr>
-        <w:t>English, Hindi, Kannada</w:t>
+        <w:t xml:space="preserve"> English, Hindi, Kannada</w:t>
       </w:r>
     </w:p>
     <w:sectPr>
-      <w:pgSz w:w="12240" w:h="15840"/>
-      <w:pgMar w:top="648" w:right="864" w:bottom="648" w:left="864" w:header="720" w:footer="720" w:gutter="0"/>
+      <w:pgSz w:w="11906" w:h="16838"/>
+      <w:pgMar w:top="850" w:right="907" w:bottom="850" w:left="907" w:header="720" w:footer="720" w:gutter="0"/>
       <w:cols w:space="720"/>
       <w:docGrid w:linePitch="360"/>
     </w:sectPr>
@@ -1373,13 +950,9 @@
     <w:name w:val="Normal"/>
     <w:qFormat/>
     <w:rsid w:val="00FC693F"/>
-    <w:pPr>
-      <w:spacing w:after="0" w:before="0" w:line="252" w:lineRule="auto"/>
-    </w:pPr>
     <w:rPr>
-      <w:rFonts w:ascii="Calibri" w:hAnsi="Calibri" w:eastAsia="Calibri"/>
-      <w:color w:val="1A1A1A"/>
-      <w:sz w:val="19"/>
+      <w:rFonts w:ascii="Arial" w:hAnsi="Arial" w:eastAsia="Arial"/>
+      <w:sz w:val="20"/>
     </w:rPr>
   </w:style>
   <w:style w:type="paragraph" w:styleId="Header">

</xml_diff>